<commit_message>
Update white paper design to match original styling
Regenerate DOCX white papers using original documents as style templates to ensure consistent design and theme.

Replit-Commit-Author: Agent
Replit-Commit-Session-Id: 1ff1730d-808e-42ab-9038-e7e4a8c0db8d
Replit-Commit-Checkpoint-Type: full_checkpoint
Replit-Commit-Event-Id: 44a2263f-d80b-4f2f-8700-c0c2fc1648bc
Replit-Commit-Screenshot-Url: https://storage.googleapis.com/screenshot-production-us-central1/46781757-2995-4279-9668-5cbf554ead29/1ff1730d-808e-42ab-9038-e7e4a8c0db8d/4izPmHb
Replit-Helium-Checkpoint-Created: true
</commit_message>
<xml_diff>
--- a/docs/future-path-white-paper-2026-v1.1.docx
+++ b/docs/future-path-white-paper-2026-v1.1.docx
@@ -3527,7 +3527,7 @@
       <w:r>
         <w:drawing>
           <wp:inline>
-            <wp:extent cx="5334000" cy="5708849"/>
+            <wp:extent cx="5943600" cy="6361288"/>
             <wp:effectExtent b="0" l="0" r="0" t="0"/>
             <wp:docPr descr="Career report showing subject strengths, career matches and premium upgrade prompt" title="" id="41" name="Picture"/>
             <a:graphic>
@@ -3548,7 +3548,7 @@
                   <pic:spPr bwMode="auto">
                     <a:xfrm>
                       <a:off x="0" y="0"/>
-                      <a:ext cx="5334000" cy="5708849"/>
+                      <a:ext cx="5943600" cy="6361288"/>
                     </a:xfrm>
                     <a:prstGeom prst="rect">
                       <a:avLst/>
@@ -3660,7 +3660,7 @@
       <w:r>
         <w:drawing>
           <wp:inline>
-            <wp:extent cx="5334000" cy="4774756"/>
+            <wp:extent cx="5943600" cy="5320442"/>
             <wp:effectExtent b="0" l="0" r="0" t="0"/>
             <wp:docPr descr="School administrator dashboard with student roster and license management" title="" id="46" name="Picture"/>
             <a:graphic>
@@ -3681,7 +3681,7 @@
                   <pic:spPr bwMode="auto">
                     <a:xfrm>
                       <a:off x="0" y="0"/>
-                      <a:ext cx="5334000" cy="4774756"/>
+                      <a:ext cx="5943600" cy="5320442"/>
                     </a:xfrm>
                     <a:prstGeom prst="rect">
                       <a:avLst/>
@@ -3751,7 +3751,7 @@
       <w:r>
         <w:drawing>
           <wp:inline>
-            <wp:extent cx="5334000" cy="3779676"/>
+            <wp:extent cx="5943600" cy="4211639"/>
             <wp:effectExtent b="0" l="0" r="0" t="0"/>
             <wp:docPr descr="Super Admin dashboard with nationwide school and student management" title="" id="50" name="Picture"/>
             <a:graphic>
@@ -3772,7 +3772,7 @@
                   <pic:spPr bwMode="auto">
                     <a:xfrm>
                       <a:off x="0" y="0"/>
-                      <a:ext cx="5334000" cy="3779676"/>
+                      <a:ext cx="5943600" cy="4211639"/>
                     </a:xfrm>
                     <a:prstGeom prst="rect">
                       <a:avLst/>
@@ -4503,7 +4503,11 @@
         <w:t xml:space="preserve">Save / Print as PDF</w:t>
       </w:r>
     </w:p>
-    <w:sectPr/>
+    <w:sectPr>
+      <w:pgSz w:h="15840" w:orient="portrait" w:w="12240"/>
+      <w:pgMar w:bottom="1440" w:footer="undefined" w:gutter="undefined" w:header="undefined" w:left="1440" w:right="1440" w:top="1440"/>
+      <w:footerReference r:id="rId9" w:type="default"/>
+    </w:sectPr>
   </w:body>
 </w:document>
 </file>
@@ -4512,6 +4516,22 @@
 <w:comments xmlns:w="http://schemas.openxmlformats.org/wordprocessingml/2006/main" xmlns:m="http://schemas.openxmlformats.org/officeDocument/2006/math" xmlns:r="http://schemas.openxmlformats.org/officeDocument/2006/relationships" xmlns:o="urn:schemas-microsoft-com:office:office" xmlns:v="urn:schemas-microsoft-com:vml" xmlns:w10="urn:schemas-microsoft-com:office:word" xmlns:a="http://schemas.openxmlformats.org/drawingml/2006/main" xmlns:pic="http://schemas.openxmlformats.org/drawingml/2006/picture" xmlns:wp="http://schemas.openxmlformats.org/drawingml/2006/wordprocessingDrawing"/>
 </file>
 
+<file path=word/footer1.xml><?xml version="1.0" encoding="utf-8"?>
+<ftr xmlns="http://schemas.openxmlformats.org/wordprocessingml/2006/main">
+  <p>
+    <pPr>
+      <spacing xmlns:ns1="http://schemas.openxmlformats.org/wordprocessingml/2006/main" ns1:lineRule="auto"/>
+    </pPr>
+    <r>
+      <rPr/>
+    </r>
+    <fldSimple xmlns:ns2="http://schemas.openxmlformats.org/wordprocessingml/2006/main" ns2:instr="PAGE">
+      <r/>
+    </fldSimple>
+  </p>
+</ftr>
+</file>
+
 <file path=word/footnotes.xml><?xml version="1.0" encoding="utf-8"?>
 <w:footnotes xmlns:w="http://schemas.openxmlformats.org/wordprocessingml/2006/main" xmlns:m="http://schemas.openxmlformats.org/officeDocument/2006/math" xmlns:r="http://schemas.openxmlformats.org/officeDocument/2006/relationships" xmlns:o="urn:schemas-microsoft-com:office:office" xmlns:v="urn:schemas-microsoft-com:vml" xmlns:w10="urn:schemas-microsoft-com:office:word" xmlns:a="http://schemas.openxmlformats.org/drawingml/2006/main" xmlns:pic="http://schemas.openxmlformats.org/drawingml/2006/picture" xmlns:wp="http://schemas.openxmlformats.org/drawingml/2006/wordprocessingDrawing">
   <w:footnote w:type="continuationSeparator" w:id="0">
@@ -4532,7 +4552,837 @@
 </file>
 
 <file path=word/numbering.xml><?xml version="1.0" encoding="utf-8"?>
-<w:numbering xmlns:w="http://schemas.openxmlformats.org/wordprocessingml/2006/main">
+<w:numbering xmlns:o="urn:schemas-microsoft-com:office:office" xmlns:r="http://schemas.openxmlformats.org/officeDocument/2006/relationships" xmlns:v="urn:schemas-microsoft-com:vml" xmlns:ve="http://schemas.openxmlformats.org/markup-compatibility/2006" xmlns:w="http://schemas.openxmlformats.org/wordprocessingml/2006/main" xmlns:w10="urn:schemas-microsoft-com:office:word" xmlns:wne="http://schemas.microsoft.com/office/word/2006/wordml" xmlns:wp="http://schemas.openxmlformats.org/drawingml/2006/wordprocessingDrawing">
+  <w:abstractNum w:abstractNumId="1">
+    <w:lvl w:ilvl="0">
+      <w:start w:val="1"/>
+      <w:numFmt w:val="decimal"/>
+      <w:lvlText w:val="%1."/>
+      <w:lvlJc w:val="left"/>
+      <w:pPr>
+        <w:tabs>
+          <w:tab w:pos="720" w:val="num"/>
+        </w:tabs>
+        <w:ind w:hanging="360" w:left="720"/>
+      </w:pPr>
+    </w:lvl>
+    <w:lvl w:ilvl="1">
+      <w:start w:val="1"/>
+      <w:numFmt w:val="decimal"/>
+      <w:lvlText w:val="%2."/>
+      <w:lvlJc w:val="left"/>
+      <w:pPr>
+        <w:tabs>
+          <w:tab w:pos="1440" w:val="num"/>
+        </w:tabs>
+        <w:ind w:hanging="360" w:left="1440"/>
+      </w:pPr>
+    </w:lvl>
+    <w:lvl w:ilvl="2">
+      <w:start w:val="1"/>
+      <w:numFmt w:val="decimal"/>
+      <w:lvlText w:val="%3."/>
+      <w:lvlJc w:val="left"/>
+      <w:pPr>
+        <w:tabs>
+          <w:tab w:pos="2160" w:val="num"/>
+        </w:tabs>
+        <w:ind w:hanging="360" w:left="2160"/>
+      </w:pPr>
+    </w:lvl>
+    <w:lvl w:ilvl="3">
+      <w:start w:val="1"/>
+      <w:numFmt w:val="decimal"/>
+      <w:lvlText w:val="%4."/>
+      <w:lvlJc w:val="left"/>
+      <w:pPr>
+        <w:tabs>
+          <w:tab w:pos="2880" w:val="num"/>
+        </w:tabs>
+        <w:ind w:hanging="360" w:left="2880"/>
+      </w:pPr>
+    </w:lvl>
+    <w:lvl w:ilvl="4">
+      <w:start w:val="1"/>
+      <w:numFmt w:val="decimal"/>
+      <w:lvlText w:val="%5."/>
+      <w:lvlJc w:val="left"/>
+      <w:pPr>
+        <w:tabs>
+          <w:tab w:pos="3600" w:val="num"/>
+        </w:tabs>
+        <w:ind w:hanging="360" w:left="3600"/>
+      </w:pPr>
+    </w:lvl>
+    <w:lvl w:ilvl="5">
+      <w:start w:val="1"/>
+      <w:numFmt w:val="decimal"/>
+      <w:lvlText w:val="%6."/>
+      <w:lvlJc w:val="left"/>
+      <w:pPr>
+        <w:tabs>
+          <w:tab w:pos="4320" w:val="num"/>
+        </w:tabs>
+        <w:ind w:hanging="360" w:left="4320"/>
+      </w:pPr>
+    </w:lvl>
+    <w:lvl w:ilvl="6">
+      <w:start w:val="1"/>
+      <w:numFmt w:val="decimal"/>
+      <w:lvlText w:val="%7."/>
+      <w:lvlJc w:val="left"/>
+      <w:pPr>
+        <w:tabs>
+          <w:tab w:pos="5040" w:val="num"/>
+        </w:tabs>
+        <w:ind w:hanging="360" w:left="5040"/>
+      </w:pPr>
+    </w:lvl>
+    <w:lvl w:ilvl="7">
+      <w:start w:val="1"/>
+      <w:numFmt w:val="decimal"/>
+      <w:lvlText w:val="%8."/>
+      <w:lvlJc w:val="left"/>
+      <w:pPr>
+        <w:tabs>
+          <w:tab w:pos="5760" w:val="num"/>
+        </w:tabs>
+        <w:ind w:hanging="360" w:left="5760"/>
+      </w:pPr>
+    </w:lvl>
+  </w:abstractNum>
+  <w:abstractNum w:abstractNumId="2">
+    <w:lvl w:ilvl="0">
+      <w:start w:val="1"/>
+      <w:numFmt w:val="bullet"/>
+      <w:lvlText w:val=""/>
+      <w:lvlJc w:val="left"/>
+      <w:pPr>
+        <w:tabs>
+          <w:tab w:pos="720" w:val="num"/>
+        </w:tabs>
+        <w:ind w:hanging="360" w:left="720"/>
+      </w:pPr>
+      <w:rPr>
+        <w:rFonts w:ascii="Symbol" w:hAnsi="Symbol" w:hint="default"/>
+      </w:rPr>
+    </w:lvl>
+    <w:lvl w:ilvl="1">
+      <w:start w:val="1"/>
+      <w:numFmt w:val="bullet"/>
+      <w:lvlText w:val=""/>
+      <w:lvlJc w:val="left"/>
+      <w:pPr>
+        <w:tabs>
+          <w:tab w:pos="1440" w:val="num"/>
+        </w:tabs>
+        <w:ind w:hanging="360" w:left="1440"/>
+      </w:pPr>
+      <w:rPr>
+        <w:rFonts w:ascii="Symbol" w:hAnsi="Symbol" w:hint="default"/>
+      </w:rPr>
+    </w:lvl>
+    <w:lvl w:ilvl="2">
+      <w:start w:val="1"/>
+      <w:numFmt w:val="bullet"/>
+      <w:lvlText w:val=""/>
+      <w:lvlJc w:val="left"/>
+      <w:pPr>
+        <w:tabs>
+          <w:tab w:pos="2160" w:val="num"/>
+        </w:tabs>
+        <w:ind w:hanging="360" w:left="2160"/>
+      </w:pPr>
+      <w:rPr>
+        <w:rFonts w:ascii="Symbol" w:hAnsi="Symbol" w:hint="default"/>
+      </w:rPr>
+    </w:lvl>
+    <w:lvl w:ilvl="3">
+      <w:start w:val="1"/>
+      <w:numFmt w:val="bullet"/>
+      <w:lvlText w:val=""/>
+      <w:lvlJc w:val="left"/>
+      <w:pPr>
+        <w:tabs>
+          <w:tab w:pos="2880" w:val="num"/>
+        </w:tabs>
+        <w:ind w:hanging="360" w:left="2880"/>
+      </w:pPr>
+      <w:rPr>
+        <w:rFonts w:ascii="Symbol" w:hAnsi="Symbol" w:hint="default"/>
+      </w:rPr>
+    </w:lvl>
+    <w:lvl w:ilvl="4">
+      <w:start w:val="1"/>
+      <w:numFmt w:val="bullet"/>
+      <w:lvlText w:val=""/>
+      <w:lvlJc w:val="left"/>
+      <w:pPr>
+        <w:tabs>
+          <w:tab w:pos="3600" w:val="num"/>
+        </w:tabs>
+        <w:ind w:hanging="360" w:left="3600"/>
+      </w:pPr>
+      <w:rPr>
+        <w:rFonts w:ascii="Symbol" w:hAnsi="Symbol" w:hint="default"/>
+      </w:rPr>
+    </w:lvl>
+    <w:lvl w:ilvl="5">
+      <w:start w:val="1"/>
+      <w:numFmt w:val="bullet"/>
+      <w:lvlText w:val=""/>
+      <w:lvlJc w:val="left"/>
+      <w:pPr>
+        <w:tabs>
+          <w:tab w:pos="4320" w:val="num"/>
+        </w:tabs>
+        <w:ind w:hanging="360" w:left="4320"/>
+      </w:pPr>
+      <w:rPr>
+        <w:rFonts w:ascii="Symbol" w:hAnsi="Symbol" w:hint="default"/>
+      </w:rPr>
+    </w:lvl>
+    <w:lvl w:ilvl="6">
+      <w:start w:val="1"/>
+      <w:numFmt w:val="bullet"/>
+      <w:lvlText w:val=""/>
+      <w:lvlJc w:val="left"/>
+      <w:pPr>
+        <w:tabs>
+          <w:tab w:pos="5040" w:val="num"/>
+        </w:tabs>
+        <w:ind w:hanging="360" w:left="5040"/>
+      </w:pPr>
+      <w:rPr>
+        <w:rFonts w:ascii="Symbol" w:hAnsi="Symbol" w:hint="default"/>
+      </w:rPr>
+    </w:lvl>
+    <w:lvl w:ilvl="7">
+      <w:start w:val="1"/>
+      <w:numFmt w:val="bullet"/>
+      <w:lvlText w:val=""/>
+      <w:lvlJc w:val="left"/>
+      <w:pPr>
+        <w:tabs>
+          <w:tab w:pos="5760" w:val="num"/>
+        </w:tabs>
+        <w:ind w:hanging="360" w:left="5760"/>
+      </w:pPr>
+      <w:rPr>
+        <w:rFonts w:ascii="Symbol" w:hAnsi="Symbol" w:hint="default"/>
+      </w:rPr>
+    </w:lvl>
+  </w:abstractNum>
+  <w:abstractNum w:abstractNumId="3">
+    <w:lvl w:ilvl="0">
+      <w:start w:val="1"/>
+      <w:numFmt w:val="bullet"/>
+      <w:lvlText w:val=""/>
+      <w:lvlJc w:val="left"/>
+      <w:pPr>
+        <w:tabs>
+          <w:tab w:pos="720" w:val="num"/>
+        </w:tabs>
+        <w:ind w:hanging="360" w:left="720"/>
+      </w:pPr>
+      <w:rPr>
+        <w:rFonts w:ascii="Symbol" w:hAnsi="Symbol" w:hint="default"/>
+      </w:rPr>
+    </w:lvl>
+    <w:lvl w:ilvl="1">
+      <w:start w:val="1"/>
+      <w:numFmt w:val="bullet"/>
+      <w:lvlText w:val=""/>
+      <w:lvlJc w:val="left"/>
+      <w:pPr>
+        <w:tabs>
+          <w:tab w:pos="1440" w:val="num"/>
+        </w:tabs>
+        <w:ind w:hanging="360" w:left="1440"/>
+      </w:pPr>
+      <w:rPr>
+        <w:rFonts w:ascii="Symbol" w:hAnsi="Symbol" w:hint="default"/>
+      </w:rPr>
+    </w:lvl>
+    <w:lvl w:ilvl="2">
+      <w:start w:val="1"/>
+      <w:numFmt w:val="bullet"/>
+      <w:lvlText w:val=""/>
+      <w:lvlJc w:val="left"/>
+      <w:pPr>
+        <w:tabs>
+          <w:tab w:pos="2160" w:val="num"/>
+        </w:tabs>
+        <w:ind w:hanging="360" w:left="2160"/>
+      </w:pPr>
+      <w:rPr>
+        <w:rFonts w:ascii="Symbol" w:hAnsi="Symbol" w:hint="default"/>
+      </w:rPr>
+    </w:lvl>
+    <w:lvl w:ilvl="3">
+      <w:start w:val="1"/>
+      <w:numFmt w:val="bullet"/>
+      <w:lvlText w:val=""/>
+      <w:lvlJc w:val="left"/>
+      <w:pPr>
+        <w:tabs>
+          <w:tab w:pos="2880" w:val="num"/>
+        </w:tabs>
+        <w:ind w:hanging="360" w:left="2880"/>
+      </w:pPr>
+      <w:rPr>
+        <w:rFonts w:ascii="Symbol" w:hAnsi="Symbol" w:hint="default"/>
+      </w:rPr>
+    </w:lvl>
+    <w:lvl w:ilvl="4">
+      <w:start w:val="1"/>
+      <w:numFmt w:val="bullet"/>
+      <w:lvlText w:val=""/>
+      <w:lvlJc w:val="left"/>
+      <w:pPr>
+        <w:tabs>
+          <w:tab w:pos="3600" w:val="num"/>
+        </w:tabs>
+        <w:ind w:hanging="360" w:left="3600"/>
+      </w:pPr>
+      <w:rPr>
+        <w:rFonts w:ascii="Symbol" w:hAnsi="Symbol" w:hint="default"/>
+      </w:rPr>
+    </w:lvl>
+    <w:lvl w:ilvl="5">
+      <w:start w:val="1"/>
+      <w:numFmt w:val="bullet"/>
+      <w:lvlText w:val=""/>
+      <w:lvlJc w:val="left"/>
+      <w:pPr>
+        <w:tabs>
+          <w:tab w:pos="4320" w:val="num"/>
+        </w:tabs>
+        <w:ind w:hanging="360" w:left="4320"/>
+      </w:pPr>
+      <w:rPr>
+        <w:rFonts w:ascii="Symbol" w:hAnsi="Symbol" w:hint="default"/>
+      </w:rPr>
+    </w:lvl>
+    <w:lvl w:ilvl="6">
+      <w:start w:val="1"/>
+      <w:numFmt w:val="bullet"/>
+      <w:lvlText w:val=""/>
+      <w:lvlJc w:val="left"/>
+      <w:pPr>
+        <w:tabs>
+          <w:tab w:pos="5040" w:val="num"/>
+        </w:tabs>
+        <w:ind w:hanging="360" w:left="5040"/>
+      </w:pPr>
+      <w:rPr>
+        <w:rFonts w:ascii="Symbol" w:hAnsi="Symbol" w:hint="default"/>
+      </w:rPr>
+    </w:lvl>
+    <w:lvl w:ilvl="7">
+      <w:start w:val="1"/>
+      <w:numFmt w:val="bullet"/>
+      <w:lvlText w:val=""/>
+      <w:lvlJc w:val="left"/>
+      <w:pPr>
+        <w:tabs>
+          <w:tab w:pos="5760" w:val="num"/>
+        </w:tabs>
+        <w:ind w:hanging="360" w:left="5760"/>
+      </w:pPr>
+      <w:rPr>
+        <w:rFonts w:ascii="Symbol" w:hAnsi="Symbol" w:hint="default"/>
+      </w:rPr>
+    </w:lvl>
+  </w:abstractNum>
+  <w:abstractNum w:abstractNumId="4">
+    <w:lvl w:ilvl="0">
+      <w:start w:val="1"/>
+      <w:numFmt w:val="bullet"/>
+      <w:lvlText w:val=""/>
+      <w:lvlJc w:val="left"/>
+      <w:pPr>
+        <w:tabs>
+          <w:tab w:pos="720" w:val="num"/>
+        </w:tabs>
+        <w:ind w:hanging="360" w:left="720"/>
+      </w:pPr>
+      <w:rPr>
+        <w:rFonts w:ascii="Symbol" w:hAnsi="Symbol" w:hint="default"/>
+      </w:rPr>
+    </w:lvl>
+    <w:lvl w:ilvl="1">
+      <w:start w:val="1"/>
+      <w:numFmt w:val="bullet"/>
+      <w:lvlText w:val=""/>
+      <w:lvlJc w:val="left"/>
+      <w:pPr>
+        <w:tabs>
+          <w:tab w:pos="1440" w:val="num"/>
+        </w:tabs>
+        <w:ind w:hanging="360" w:left="1440"/>
+      </w:pPr>
+      <w:rPr>
+        <w:rFonts w:ascii="Symbol" w:hAnsi="Symbol" w:hint="default"/>
+      </w:rPr>
+    </w:lvl>
+    <w:lvl w:ilvl="2">
+      <w:start w:val="1"/>
+      <w:numFmt w:val="bullet"/>
+      <w:lvlText w:val=""/>
+      <w:lvlJc w:val="left"/>
+      <w:pPr>
+        <w:tabs>
+          <w:tab w:pos="2160" w:val="num"/>
+        </w:tabs>
+        <w:ind w:hanging="360" w:left="2160"/>
+      </w:pPr>
+      <w:rPr>
+        <w:rFonts w:ascii="Symbol" w:hAnsi="Symbol" w:hint="default"/>
+      </w:rPr>
+    </w:lvl>
+    <w:lvl w:ilvl="3">
+      <w:start w:val="1"/>
+      <w:numFmt w:val="bullet"/>
+      <w:lvlText w:val=""/>
+      <w:lvlJc w:val="left"/>
+      <w:pPr>
+        <w:tabs>
+          <w:tab w:pos="2880" w:val="num"/>
+        </w:tabs>
+        <w:ind w:hanging="360" w:left="2880"/>
+      </w:pPr>
+      <w:rPr>
+        <w:rFonts w:ascii="Symbol" w:hAnsi="Symbol" w:hint="default"/>
+      </w:rPr>
+    </w:lvl>
+    <w:lvl w:ilvl="4">
+      <w:start w:val="1"/>
+      <w:numFmt w:val="bullet"/>
+      <w:lvlText w:val=""/>
+      <w:lvlJc w:val="left"/>
+      <w:pPr>
+        <w:tabs>
+          <w:tab w:pos="3600" w:val="num"/>
+        </w:tabs>
+        <w:ind w:hanging="360" w:left="3600"/>
+      </w:pPr>
+      <w:rPr>
+        <w:rFonts w:ascii="Symbol" w:hAnsi="Symbol" w:hint="default"/>
+      </w:rPr>
+    </w:lvl>
+    <w:lvl w:ilvl="5">
+      <w:start w:val="1"/>
+      <w:numFmt w:val="bullet"/>
+      <w:lvlText w:val=""/>
+      <w:lvlJc w:val="left"/>
+      <w:pPr>
+        <w:tabs>
+          <w:tab w:pos="4320" w:val="num"/>
+        </w:tabs>
+        <w:ind w:hanging="360" w:left="4320"/>
+      </w:pPr>
+      <w:rPr>
+        <w:rFonts w:ascii="Symbol" w:hAnsi="Symbol" w:hint="default"/>
+      </w:rPr>
+    </w:lvl>
+    <w:lvl w:ilvl="6">
+      <w:start w:val="1"/>
+      <w:numFmt w:val="bullet"/>
+      <w:lvlText w:val=""/>
+      <w:lvlJc w:val="left"/>
+      <w:pPr>
+        <w:tabs>
+          <w:tab w:pos="5040" w:val="num"/>
+        </w:tabs>
+        <w:ind w:hanging="360" w:left="5040"/>
+      </w:pPr>
+      <w:rPr>
+        <w:rFonts w:ascii="Symbol" w:hAnsi="Symbol" w:hint="default"/>
+      </w:rPr>
+    </w:lvl>
+    <w:lvl w:ilvl="7">
+      <w:start w:val="1"/>
+      <w:numFmt w:val="bullet"/>
+      <w:lvlText w:val=""/>
+      <w:lvlJc w:val="left"/>
+      <w:pPr>
+        <w:tabs>
+          <w:tab w:pos="5760" w:val="num"/>
+        </w:tabs>
+        <w:ind w:hanging="360" w:left="5760"/>
+      </w:pPr>
+      <w:rPr>
+        <w:rFonts w:ascii="Symbol" w:hAnsi="Symbol" w:hint="default"/>
+      </w:rPr>
+    </w:lvl>
+  </w:abstractNum>
+  <w:abstractNum w:abstractNumId="5">
+    <w:lvl w:ilvl="0">
+      <w:start w:val="1"/>
+      <w:numFmt w:val="bullet"/>
+      <w:lvlText w:val=""/>
+      <w:lvlJc w:val="left"/>
+      <w:pPr>
+        <w:tabs>
+          <w:tab w:pos="720" w:val="num"/>
+        </w:tabs>
+        <w:ind w:hanging="360" w:left="720"/>
+      </w:pPr>
+      <w:rPr>
+        <w:rFonts w:ascii="Symbol" w:hAnsi="Symbol" w:hint="default"/>
+      </w:rPr>
+    </w:lvl>
+    <w:lvl w:ilvl="1">
+      <w:start w:val="1"/>
+      <w:numFmt w:val="bullet"/>
+      <w:lvlText w:val=""/>
+      <w:lvlJc w:val="left"/>
+      <w:pPr>
+        <w:tabs>
+          <w:tab w:pos="1440" w:val="num"/>
+        </w:tabs>
+        <w:ind w:hanging="360" w:left="1440"/>
+      </w:pPr>
+      <w:rPr>
+        <w:rFonts w:ascii="Symbol" w:hAnsi="Symbol" w:hint="default"/>
+      </w:rPr>
+    </w:lvl>
+    <w:lvl w:ilvl="2">
+      <w:start w:val="1"/>
+      <w:numFmt w:val="bullet"/>
+      <w:lvlText w:val=""/>
+      <w:lvlJc w:val="left"/>
+      <w:pPr>
+        <w:tabs>
+          <w:tab w:pos="2160" w:val="num"/>
+        </w:tabs>
+        <w:ind w:hanging="360" w:left="2160"/>
+      </w:pPr>
+      <w:rPr>
+        <w:rFonts w:ascii="Symbol" w:hAnsi="Symbol" w:hint="default"/>
+      </w:rPr>
+    </w:lvl>
+    <w:lvl w:ilvl="3">
+      <w:start w:val="1"/>
+      <w:numFmt w:val="bullet"/>
+      <w:lvlText w:val=""/>
+      <w:lvlJc w:val="left"/>
+      <w:pPr>
+        <w:tabs>
+          <w:tab w:pos="2880" w:val="num"/>
+        </w:tabs>
+        <w:ind w:hanging="360" w:left="2880"/>
+      </w:pPr>
+      <w:rPr>
+        <w:rFonts w:ascii="Symbol" w:hAnsi="Symbol" w:hint="default"/>
+      </w:rPr>
+    </w:lvl>
+    <w:lvl w:ilvl="4">
+      <w:start w:val="1"/>
+      <w:numFmt w:val="bullet"/>
+      <w:lvlText w:val=""/>
+      <w:lvlJc w:val="left"/>
+      <w:pPr>
+        <w:tabs>
+          <w:tab w:pos="3600" w:val="num"/>
+        </w:tabs>
+        <w:ind w:hanging="360" w:left="3600"/>
+      </w:pPr>
+      <w:rPr>
+        <w:rFonts w:ascii="Symbol" w:hAnsi="Symbol" w:hint="default"/>
+      </w:rPr>
+    </w:lvl>
+    <w:lvl w:ilvl="5">
+      <w:start w:val="1"/>
+      <w:numFmt w:val="bullet"/>
+      <w:lvlText w:val=""/>
+      <w:lvlJc w:val="left"/>
+      <w:pPr>
+        <w:tabs>
+          <w:tab w:pos="4320" w:val="num"/>
+        </w:tabs>
+        <w:ind w:hanging="360" w:left="4320"/>
+      </w:pPr>
+      <w:rPr>
+        <w:rFonts w:ascii="Symbol" w:hAnsi="Symbol" w:hint="default"/>
+      </w:rPr>
+    </w:lvl>
+    <w:lvl w:ilvl="6">
+      <w:start w:val="1"/>
+      <w:numFmt w:val="bullet"/>
+      <w:lvlText w:val=""/>
+      <w:lvlJc w:val="left"/>
+      <w:pPr>
+        <w:tabs>
+          <w:tab w:pos="5040" w:val="num"/>
+        </w:tabs>
+        <w:ind w:hanging="360" w:left="5040"/>
+      </w:pPr>
+      <w:rPr>
+        <w:rFonts w:ascii="Symbol" w:hAnsi="Symbol" w:hint="default"/>
+      </w:rPr>
+    </w:lvl>
+    <w:lvl w:ilvl="7">
+      <w:start w:val="1"/>
+      <w:numFmt w:val="bullet"/>
+      <w:lvlText w:val=""/>
+      <w:lvlJc w:val="left"/>
+      <w:pPr>
+        <w:tabs>
+          <w:tab w:pos="5760" w:val="num"/>
+        </w:tabs>
+        <w:ind w:hanging="360" w:left="5760"/>
+      </w:pPr>
+      <w:rPr>
+        <w:rFonts w:ascii="Symbol" w:hAnsi="Symbol" w:hint="default"/>
+      </w:rPr>
+    </w:lvl>
+  </w:abstractNum>
+  <w:abstractNum w:abstractNumId="6">
+    <w:lvl w:ilvl="0">
+      <w:start w:val="1"/>
+      <w:numFmt w:val="bullet"/>
+      <w:lvlText w:val=""/>
+      <w:lvlJc w:val="left"/>
+      <w:pPr>
+        <w:tabs>
+          <w:tab w:pos="720" w:val="num"/>
+        </w:tabs>
+        <w:ind w:hanging="360" w:left="720"/>
+      </w:pPr>
+      <w:rPr>
+        <w:rFonts w:ascii="Symbol" w:hAnsi="Symbol" w:hint="default"/>
+      </w:rPr>
+    </w:lvl>
+    <w:lvl w:ilvl="1">
+      <w:start w:val="1"/>
+      <w:numFmt w:val="bullet"/>
+      <w:lvlText w:val=""/>
+      <w:lvlJc w:val="left"/>
+      <w:pPr>
+        <w:tabs>
+          <w:tab w:pos="1440" w:val="num"/>
+        </w:tabs>
+        <w:ind w:hanging="360" w:left="1440"/>
+      </w:pPr>
+      <w:rPr>
+        <w:rFonts w:ascii="Symbol" w:hAnsi="Symbol" w:hint="default"/>
+      </w:rPr>
+    </w:lvl>
+    <w:lvl w:ilvl="2">
+      <w:start w:val="1"/>
+      <w:numFmt w:val="bullet"/>
+      <w:lvlText w:val=""/>
+      <w:lvlJc w:val="left"/>
+      <w:pPr>
+        <w:tabs>
+          <w:tab w:pos="2160" w:val="num"/>
+        </w:tabs>
+        <w:ind w:hanging="360" w:left="2160"/>
+      </w:pPr>
+      <w:rPr>
+        <w:rFonts w:ascii="Symbol" w:hAnsi="Symbol" w:hint="default"/>
+      </w:rPr>
+    </w:lvl>
+    <w:lvl w:ilvl="3">
+      <w:start w:val="1"/>
+      <w:numFmt w:val="bullet"/>
+      <w:lvlText w:val=""/>
+      <w:lvlJc w:val="left"/>
+      <w:pPr>
+        <w:tabs>
+          <w:tab w:pos="2880" w:val="num"/>
+        </w:tabs>
+        <w:ind w:hanging="360" w:left="2880"/>
+      </w:pPr>
+      <w:rPr>
+        <w:rFonts w:ascii="Symbol" w:hAnsi="Symbol" w:hint="default"/>
+      </w:rPr>
+    </w:lvl>
+    <w:lvl w:ilvl="4">
+      <w:start w:val="1"/>
+      <w:numFmt w:val="bullet"/>
+      <w:lvlText w:val=""/>
+      <w:lvlJc w:val="left"/>
+      <w:pPr>
+        <w:tabs>
+          <w:tab w:pos="3600" w:val="num"/>
+        </w:tabs>
+        <w:ind w:hanging="360" w:left="3600"/>
+      </w:pPr>
+      <w:rPr>
+        <w:rFonts w:ascii="Symbol" w:hAnsi="Symbol" w:hint="default"/>
+      </w:rPr>
+    </w:lvl>
+    <w:lvl w:ilvl="5">
+      <w:start w:val="1"/>
+      <w:numFmt w:val="bullet"/>
+      <w:lvlText w:val=""/>
+      <w:lvlJc w:val="left"/>
+      <w:pPr>
+        <w:tabs>
+          <w:tab w:pos="4320" w:val="num"/>
+        </w:tabs>
+        <w:ind w:hanging="360" w:left="4320"/>
+      </w:pPr>
+      <w:rPr>
+        <w:rFonts w:ascii="Symbol" w:hAnsi="Symbol" w:hint="default"/>
+      </w:rPr>
+    </w:lvl>
+    <w:lvl w:ilvl="6">
+      <w:start w:val="1"/>
+      <w:numFmt w:val="bullet"/>
+      <w:lvlText w:val=""/>
+      <w:lvlJc w:val="left"/>
+      <w:pPr>
+        <w:tabs>
+          <w:tab w:pos="5040" w:val="num"/>
+        </w:tabs>
+        <w:ind w:hanging="360" w:left="5040"/>
+      </w:pPr>
+      <w:rPr>
+        <w:rFonts w:ascii="Symbol" w:hAnsi="Symbol" w:hint="default"/>
+      </w:rPr>
+    </w:lvl>
+    <w:lvl w:ilvl="7">
+      <w:start w:val="1"/>
+      <w:numFmt w:val="bullet"/>
+      <w:lvlText w:val=""/>
+      <w:lvlJc w:val="left"/>
+      <w:pPr>
+        <w:tabs>
+          <w:tab w:pos="5760" w:val="num"/>
+        </w:tabs>
+        <w:ind w:hanging="360" w:left="5760"/>
+      </w:pPr>
+      <w:rPr>
+        <w:rFonts w:ascii="Symbol" w:hAnsi="Symbol" w:hint="default"/>
+      </w:rPr>
+    </w:lvl>
+  </w:abstractNum>
+  <w:abstractNum w:abstractNumId="7">
+    <w:lvl w:ilvl="0">
+      <w:start w:val="1"/>
+      <w:numFmt w:val="bullet"/>
+      <w:lvlText w:val=""/>
+      <w:lvlJc w:val="left"/>
+      <w:pPr>
+        <w:tabs>
+          <w:tab w:pos="720" w:val="num"/>
+        </w:tabs>
+        <w:ind w:hanging="360" w:left="720"/>
+      </w:pPr>
+      <w:rPr>
+        <w:rFonts w:ascii="Symbol" w:hAnsi="Symbol" w:hint="default"/>
+      </w:rPr>
+    </w:lvl>
+    <w:lvl w:ilvl="1">
+      <w:start w:val="1"/>
+      <w:numFmt w:val="bullet"/>
+      <w:lvlText w:val=""/>
+      <w:lvlJc w:val="left"/>
+      <w:pPr>
+        <w:tabs>
+          <w:tab w:pos="1440" w:val="num"/>
+        </w:tabs>
+        <w:ind w:hanging="360" w:left="1440"/>
+      </w:pPr>
+      <w:rPr>
+        <w:rFonts w:ascii="Symbol" w:hAnsi="Symbol" w:hint="default"/>
+      </w:rPr>
+    </w:lvl>
+    <w:lvl w:ilvl="2">
+      <w:start w:val="1"/>
+      <w:numFmt w:val="bullet"/>
+      <w:lvlText w:val=""/>
+      <w:lvlJc w:val="left"/>
+      <w:pPr>
+        <w:tabs>
+          <w:tab w:pos="2160" w:val="num"/>
+        </w:tabs>
+        <w:ind w:hanging="360" w:left="2160"/>
+      </w:pPr>
+      <w:rPr>
+        <w:rFonts w:ascii="Symbol" w:hAnsi="Symbol" w:hint="default"/>
+      </w:rPr>
+    </w:lvl>
+    <w:lvl w:ilvl="3">
+      <w:start w:val="1"/>
+      <w:numFmt w:val="bullet"/>
+      <w:lvlText w:val=""/>
+      <w:lvlJc w:val="left"/>
+      <w:pPr>
+        <w:tabs>
+          <w:tab w:pos="2880" w:val="num"/>
+        </w:tabs>
+        <w:ind w:hanging="360" w:left="2880"/>
+      </w:pPr>
+      <w:rPr>
+        <w:rFonts w:ascii="Symbol" w:hAnsi="Symbol" w:hint="default"/>
+      </w:rPr>
+    </w:lvl>
+    <w:lvl w:ilvl="4">
+      <w:start w:val="1"/>
+      <w:numFmt w:val="bullet"/>
+      <w:lvlText w:val=""/>
+      <w:lvlJc w:val="left"/>
+      <w:pPr>
+        <w:tabs>
+          <w:tab w:pos="3600" w:val="num"/>
+        </w:tabs>
+        <w:ind w:hanging="360" w:left="3600"/>
+      </w:pPr>
+      <w:rPr>
+        <w:rFonts w:ascii="Symbol" w:hAnsi="Symbol" w:hint="default"/>
+      </w:rPr>
+    </w:lvl>
+    <w:lvl w:ilvl="5">
+      <w:start w:val="1"/>
+      <w:numFmt w:val="bullet"/>
+      <w:lvlText w:val=""/>
+      <w:lvlJc w:val="left"/>
+      <w:pPr>
+        <w:tabs>
+          <w:tab w:pos="4320" w:val="num"/>
+        </w:tabs>
+        <w:ind w:hanging="360" w:left="4320"/>
+      </w:pPr>
+      <w:rPr>
+        <w:rFonts w:ascii="Symbol" w:hAnsi="Symbol" w:hint="default"/>
+      </w:rPr>
+    </w:lvl>
+    <w:lvl w:ilvl="6">
+      <w:start w:val="1"/>
+      <w:numFmt w:val="bullet"/>
+      <w:lvlText w:val=""/>
+      <w:lvlJc w:val="left"/>
+      <w:pPr>
+        <w:tabs>
+          <w:tab w:pos="5040" w:val="num"/>
+        </w:tabs>
+        <w:ind w:hanging="360" w:left="5040"/>
+      </w:pPr>
+      <w:rPr>
+        <w:rFonts w:ascii="Symbol" w:hAnsi="Symbol" w:hint="default"/>
+      </w:rPr>
+    </w:lvl>
+    <w:lvl w:ilvl="7">
+      <w:start w:val="1"/>
+      <w:numFmt w:val="bullet"/>
+      <w:lvlText w:val=""/>
+      <w:lvlJc w:val="left"/>
+      <w:pPr>
+        <w:tabs>
+          <w:tab w:pos="5760" w:val="num"/>
+        </w:tabs>
+        <w:ind w:hanging="360" w:left="5760"/>
+      </w:pPr>
+      <w:rPr>
+        <w:rFonts w:ascii="Symbol" w:hAnsi="Symbol" w:hint="default"/>
+      </w:rPr>
+    </w:lvl>
+  </w:abstractNum>
   <w:abstractNum w:abstractNumId="990">
     <w:nsid w:val="0000A990"/>
     <w:multiLevelType w:val="multilevel"/>
@@ -4770,6 +5620,27 @@
       </w:pPr>
     </w:lvl>
   </w:abstractNum>
+  <w:num w:numId="1">
+    <w:abstractNumId w:val="1"/>
+  </w:num>
+  <w:num w:numId="2">
+    <w:abstractNumId w:val="2"/>
+  </w:num>
+  <w:num w:numId="3">
+    <w:abstractNumId w:val="3"/>
+  </w:num>
+  <w:num w:numId="4">
+    <w:abstractNumId w:val="4"/>
+  </w:num>
+  <w:num w:numId="5">
+    <w:abstractNumId w:val="5"/>
+  </w:num>
+  <w:num w:numId="6">
+    <w:abstractNumId w:val="6"/>
+  </w:num>
+  <w:num w:numId="7">
+    <w:abstractNumId w:val="7"/>
+  </w:num>
   <w:num w:numId="1000">
     <w:abstractNumId w:val="990"/>
   </w:num>
@@ -4829,496 +5700,138 @@
   <w:docDefaults>
     <w:rPrDefault>
       <w:rPr>
-        <w:rFonts w:asciiTheme="minorHAnsi" w:cstheme="minorBidi" w:eastAsiaTheme="minorHAnsi" w:hAnsiTheme="minorHAnsi"/>
-        <w:sz w:val="24"/>
-        <w:szCs w:val="24"/>
+        <w:rFonts w:ascii="Calibri" w:cstheme="minorBidi" w:eastAsiaTheme="minorHAnsi" w:hAnsiTheme="minorHAnsi"/>
+        <w:sz w:val="22"/>
+        <w:szCs w:val="22"/>
         <w:lang w:bidi="ar-SA" w:eastAsia="en-US" w:val="en"/>
       </w:rPr>
     </w:rPrDefault>
     <w:pPrDefault>
       <w:pPr>
-        <w:spacing w:after="200"/>
+        <w:spacing w:after="120" w:line="240" w:lineRule="atLeast"/>
       </w:pPr>
     </w:pPrDefault>
   </w:docDefaults>
-  <w:latentStyles w:count="276" w:defLockedState="0" w:defQFormat="0" w:defSemiHidden="0" w:defUIPriority="0" w:defUnhideWhenUsed="0"/>
-  <w:style w:default="1" w:styleId="Normal" w:type="paragraph">
-    <w:name w:val="Normal"/>
-    <w:qFormat/>
-  </w:style>
-  <w:style w:styleId="BodyText" w:type="paragraph">
-    <w:name w:val="Body Text"/>
-    <w:basedOn w:val="Normal"/>
-    <w:link w:val="BodyTextChar"/>
-    <w:qFormat/>
-    <w:pPr>
-      <w:spacing w:after="180" w:before="180"/>
-    </w:pPr>
-  </w:style>
-  <w:style w:customStyle="1" w:styleId="FirstParagraph" w:type="paragraph">
-    <w:name w:val="First Paragraph"/>
-    <w:basedOn w:val="BodyText"/>
-    <w:next w:val="BodyText"/>
-    <w:qFormat/>
-  </w:style>
-  <w:style w:customStyle="1" w:styleId="Compact" w:type="paragraph">
-    <w:name w:val="Compact"/>
-    <w:basedOn w:val="BodyText"/>
-    <w:qFormat/>
-    <w:pPr>
-      <w:spacing w:after="36" w:before="36"/>
-    </w:pPr>
-  </w:style>
-  <w:style w:styleId="Title" w:type="paragraph">
-    <w:name w:val="Title"/>
-    <w:basedOn w:val="Normal"/>
-    <w:next w:val="BodyText"/>
-    <w:qFormat/>
-    <w:pPr>
-      <w:keepNext/>
-      <w:keepLines/>
-      <w:spacing w:after="240" w:before="480"/>
-      <w:jc w:val="center"/>
-    </w:pPr>
+  <w:style w:styleId="Hyperlink" w:type="character">
+    <w:name w:val="Hyperlink"/>
     <w:rPr>
-      <w:rFonts w:asciiTheme="majorHAnsi" w:cstheme="majorBidi" w:eastAsiaTheme="majorEastAsia" w:hAnsiTheme="majorHAnsi"/>
-      <w:b/>
-      <w:bCs/>
-      <w:color w:themeColor="accent1" w:themeShade="B5" w:val="345A8A"/>
-      <w:sz w:val="36"/>
-      <w:szCs w:val="36"/>
+      <w:color w:val="0000FF"/>
+      <w:u w:val="single"/>
     </w:rPr>
   </w:style>
-  <w:style w:styleId="Subtitle" w:type="paragraph">
-    <w:name w:val="Subtitle"/>
-    <w:basedOn w:val="Title"/>
-    <w:next w:val="BodyText"/>
-    <w:qFormat/>
-    <w:pPr>
-      <w:keepNext/>
-      <w:keepLines/>
-      <w:spacing w:after="240" w:before="240"/>
-      <w:jc w:val="center"/>
-    </w:pPr>
-    <w:rPr>
-      <w:sz w:val="30"/>
-      <w:szCs w:val="30"/>
-    </w:rPr>
-  </w:style>
-  <w:style w:customStyle="1" w:styleId="Author" w:type="paragraph">
-    <w:name w:val="Author"/>
-    <w:next w:val="BodyText"/>
-    <w:qFormat/>
-    <w:pPr>
-      <w:keepNext/>
-      <w:keepLines/>
-      <w:jc w:val="center"/>
-    </w:pPr>
-  </w:style>
-  <w:style w:styleId="Date" w:type="paragraph">
-    <w:name w:val="Date"/>
-    <w:next w:val="BodyText"/>
-    <w:qFormat/>
-    <w:pPr>
-      <w:keepNext/>
-      <w:keepLines/>
-      <w:jc w:val="center"/>
-    </w:pPr>
-  </w:style>
-  <w:style w:customStyle="1" w:styleId="AbstractTitle" w:type="paragraph">
-    <w:name w:val="Abstract Title"/>
+  <w:style w:styleId="Heading1" w:type="paragraph">
+    <w:name w:val="heading 1"/>
     <w:basedOn w:val="Normal"/>
-    <w:next w:val="Abstract"/>
-    <w:qFormat/>
-    <w:pPr>
-      <w:keepNext/>
-      <w:keepLines/>
-      <w:spacing w:after="0" w:before="300"/>
-      <w:jc w:val="center"/>
-    </w:pPr>
-    <w:rPr>
-      <w:b/>
-      <w:color w:val="345A8A"/>
-      <w:sz w:val="20"/>
-      <w:szCs w:val="20"/>
-    </w:rPr>
-  </w:style>
-  <w:style w:customStyle="1" w:styleId="Abstract" w:type="paragraph">
-    <w:name w:val="Abstract"/>
-    <w:basedOn w:val="Normal"/>
-    <w:next w:val="BodyText"/>
-    <w:qFormat/>
-    <w:pPr>
-      <w:keepNext/>
-      <w:keepLines/>
-      <w:spacing w:after="300" w:before="100"/>
-    </w:pPr>
-    <w:rPr>
-      <w:sz w:val="20"/>
-      <w:szCs w:val="20"/>
-    </w:rPr>
-  </w:style>
-  <w:style w:styleId="Bibliography" w:type="paragraph">
-    <w:name w:val="Bibliography"/>
-    <w:basedOn w:val="Normal"/>
-    <w:next w:val="Bibliography"/>
-    <w:qFormat/>
-    <w:pPr/>
-    <w:rPr/>
-  </w:style>
-  <w:style w:styleId="Heading1" w:type="paragraph">
-    <w:name w:val="Heading 1"/>
-    <w:basedOn w:val="Normal"/>
-    <w:next w:val="BodyText"/>
+    <w:next w:val="Normal"/>
     <w:uiPriority w:val="9"/>
     <w:qFormat/>
     <w:pPr>
       <w:keepNext/>
       <w:keepLines/>
-      <w:spacing w:after="0" w:before="480"/>
+      <w:spacing w:before="480"/>
       <w:outlineLvl w:val="0"/>
     </w:pPr>
     <w:rPr>
-      <w:rFonts w:asciiTheme="majorHAnsi" w:cstheme="majorBidi" w:eastAsiaTheme="majorEastAsia" w:hAnsiTheme="majorHAnsi"/>
       <w:b/>
-      <w:bCs/>
-      <w:color w:themeColor="accent1" w:val="4F81BD"/>
-      <w:sz w:val="32"/>
-      <w:szCs w:val="32"/>
+      <w:sz w:val="48"/>
+      <w:szCs w:val="48"/>
     </w:rPr>
   </w:style>
   <w:style w:styleId="Heading2" w:type="paragraph">
-    <w:name w:val="Heading 2"/>
+    <w:name w:val="heading 2"/>
     <w:basedOn w:val="Normal"/>
-    <w:next w:val="BodyText"/>
+    <w:next w:val="Normal"/>
     <w:uiPriority w:val="9"/>
     <w:unhideWhenUsed/>
     <w:qFormat/>
     <w:pPr>
       <w:keepNext/>
       <w:keepLines/>
-      <w:spacing w:after="0" w:before="200"/>
+      <w:spacing w:after="80" w:before="360"/>
       <w:outlineLvl w:val="1"/>
     </w:pPr>
     <w:rPr>
-      <w:rFonts w:asciiTheme="majorHAnsi" w:cstheme="majorBidi" w:eastAsiaTheme="majorEastAsia" w:hAnsiTheme="majorHAnsi"/>
       <w:b/>
-      <w:bCs/>
-      <w:color w:themeColor="accent1" w:val="4F81BD"/>
-      <w:sz w:val="28"/>
-      <w:szCs w:val="28"/>
+      <w:sz w:val="36"/>
+      <w:szCs w:val="36"/>
     </w:rPr>
   </w:style>
   <w:style w:styleId="Heading3" w:type="paragraph">
-    <w:name w:val="Heading 3"/>
+    <w:name w:val="heading 3"/>
     <w:basedOn w:val="Normal"/>
-    <w:next w:val="BodyText"/>
+    <w:next w:val="Normal"/>
     <w:uiPriority w:val="9"/>
+    <w:semiHidden/>
     <w:unhideWhenUsed/>
     <w:qFormat/>
     <w:pPr>
       <w:keepNext/>
       <w:keepLines/>
-      <w:spacing w:after="0" w:before="200"/>
+      <w:spacing w:after="80" w:before="280"/>
       <w:outlineLvl w:val="2"/>
     </w:pPr>
     <w:rPr>
-      <w:rFonts w:asciiTheme="majorHAnsi" w:cstheme="majorBidi" w:eastAsiaTheme="majorEastAsia" w:hAnsiTheme="majorHAnsi"/>
       <w:b/>
-      <w:bCs/>
-      <w:color w:themeColor="accent1" w:val="4F81BD"/>
-      <w:sz w:val="24"/>
-      <w:szCs w:val="24"/>
+      <w:sz w:val="28"/>
+      <w:szCs w:val="28"/>
     </w:rPr>
   </w:style>
   <w:style w:styleId="Heading4" w:type="paragraph">
-    <w:name w:val="Heading 4"/>
+    <w:name w:val="heading 4"/>
     <w:basedOn w:val="Normal"/>
-    <w:next w:val="BodyText"/>
+    <w:next w:val="Normal"/>
     <w:uiPriority w:val="9"/>
+    <w:semiHidden/>
     <w:unhideWhenUsed/>
     <w:qFormat/>
     <w:pPr>
       <w:keepNext/>
       <w:keepLines/>
-      <w:spacing w:after="0" w:before="200"/>
+      <w:spacing w:after="40" w:before="240"/>
       <w:outlineLvl w:val="3"/>
     </w:pPr>
     <w:rPr>
-      <w:rFonts w:asciiTheme="majorHAnsi" w:cstheme="majorBidi" w:eastAsiaTheme="majorEastAsia" w:hAnsiTheme="majorHAnsi"/>
-      <w:bCs/>
-      <w:i/>
-      <w:color w:themeColor="accent1" w:val="4F81BD"/>
+      <w:b/>
       <w:sz w:val="24"/>
       <w:szCs w:val="24"/>
     </w:rPr>
   </w:style>
   <w:style w:styleId="Heading5" w:type="paragraph">
-    <w:name w:val="Heading 5"/>
+    <w:name w:val="heading 5"/>
     <w:basedOn w:val="Normal"/>
-    <w:next w:val="BodyText"/>
+    <w:next w:val="Normal"/>
     <w:uiPriority w:val="9"/>
+    <w:semiHidden/>
     <w:unhideWhenUsed/>
     <w:qFormat/>
     <w:pPr>
       <w:keepNext/>
       <w:keepLines/>
-      <w:spacing w:after="0" w:before="200"/>
+      <w:spacing w:after="40" w:before="220"/>
       <w:outlineLvl w:val="4"/>
     </w:pPr>
     <w:rPr>
-      <w:rFonts w:asciiTheme="majorHAnsi" w:cstheme="majorBidi" w:eastAsiaTheme="majorEastAsia" w:hAnsiTheme="majorHAnsi"/>
-      <w:iCs/>
-      <w:color w:themeColor="accent1" w:val="4F81BD"/>
-      <w:sz w:val="24"/>
-      <w:szCs w:val="24"/>
+      <w:b/>
     </w:rPr>
   </w:style>
   <w:style w:styleId="Heading6" w:type="paragraph">
-    <w:name w:val="Heading 6"/>
+    <w:name w:val="heading 6"/>
     <w:basedOn w:val="Normal"/>
-    <w:next w:val="BodyText"/>
+    <w:next w:val="Normal"/>
     <w:uiPriority w:val="9"/>
+    <w:semiHidden/>
     <w:unhideWhenUsed/>
     <w:qFormat/>
     <w:pPr>
       <w:keepNext/>
       <w:keepLines/>
-      <w:spacing w:after="0" w:before="200"/>
+      <w:spacing w:after="40" w:before="200"/>
       <w:outlineLvl w:val="5"/>
     </w:pPr>
     <w:rPr>
-      <w:rFonts w:asciiTheme="majorHAnsi" w:cstheme="majorBidi" w:eastAsiaTheme="majorEastAsia" w:hAnsiTheme="majorHAnsi"/>
-      <w:color w:themeColor="accent1" w:val="4F81BD"/>
-      <w:sz w:val="24"/>
-      <w:szCs w:val="24"/>
-    </w:rPr>
-  </w:style>
-  <w:style w:styleId="Heading7" w:type="paragraph">
-    <w:name w:val="Heading 7"/>
-    <w:basedOn w:val="Normal"/>
-    <w:next w:val="BodyText"/>
-    <w:uiPriority w:val="9"/>
-    <w:unhideWhenUsed/>
-    <w:qFormat/>
-    <w:pPr>
-      <w:keepNext/>
-      <w:keepLines/>
-      <w:spacing w:after="0" w:before="200"/>
-      <w:outlineLvl w:val="6"/>
-    </w:pPr>
-    <w:rPr>
-      <w:rFonts w:asciiTheme="majorHAnsi" w:cstheme="majorBidi" w:eastAsiaTheme="majorEastAsia" w:hAnsiTheme="majorHAnsi"/>
-      <w:color w:themeColor="accent1" w:val="4F81BD"/>
-      <w:sz w:val="24"/>
-      <w:szCs w:val="24"/>
-    </w:rPr>
-  </w:style>
-  <w:style w:styleId="Heading8" w:type="paragraph">
-    <w:name w:val="Heading 8"/>
-    <w:basedOn w:val="Normal"/>
-    <w:next w:val="BodyText"/>
-    <w:uiPriority w:val="9"/>
-    <w:unhideWhenUsed/>
-    <w:qFormat/>
-    <w:pPr>
-      <w:keepNext/>
-      <w:keepLines/>
-      <w:spacing w:after="0" w:before="200"/>
-      <w:outlineLvl w:val="7"/>
-    </w:pPr>
-    <w:rPr>
-      <w:rFonts w:asciiTheme="majorHAnsi" w:cstheme="majorBidi" w:eastAsiaTheme="majorEastAsia" w:hAnsiTheme="majorHAnsi"/>
-      <w:color w:themeColor="accent1" w:val="4F81BD"/>
-      <w:sz w:val="24"/>
-      <w:szCs w:val="24"/>
-    </w:rPr>
-  </w:style>
-  <w:style w:styleId="Heading9" w:type="paragraph">
-    <w:name w:val="Heading 9"/>
-    <w:basedOn w:val="Normal"/>
-    <w:next w:val="BodyText"/>
-    <w:uiPriority w:val="9"/>
-    <w:unhideWhenUsed/>
-    <w:qFormat/>
-    <w:pPr>
-      <w:keepNext/>
-      <w:keepLines/>
-      <w:spacing w:after="0" w:before="200"/>
-      <w:outlineLvl w:val="8"/>
-    </w:pPr>
-    <w:rPr>
-      <w:rFonts w:asciiTheme="majorHAnsi" w:cstheme="majorBidi" w:eastAsiaTheme="majorEastAsia" w:hAnsiTheme="majorHAnsi"/>
-      <w:color w:themeColor="accent1" w:val="4F81BD"/>
-      <w:sz w:val="24"/>
-      <w:szCs w:val="24"/>
-    </w:rPr>
-  </w:style>
-  <w:style w:styleId="BlockText" w:type="paragraph">
-    <w:name w:val="Block Text"/>
-    <w:basedOn w:val="BodyText"/>
-    <w:next w:val="BodyText"/>
-    <w:uiPriority w:val="9"/>
-    <w:unhideWhenUsed/>
-    <w:qFormat/>
-    <w:pPr>
-      <w:spacing w:after="100" w:before="100"/>
-      <w:ind w:firstLine="0" w:left="480" w:right="480"/>
-    </w:pPr>
-  </w:style>
-  <w:style w:styleId="FootnoteText" w:type="paragraph">
-    <w:name w:val="Footnote Text"/>
-    <w:basedOn w:val="Normal"/>
-    <w:next w:val="FootnoteText"/>
-    <w:uiPriority w:val="9"/>
-    <w:unhideWhenUsed/>
-    <w:qFormat/>
-  </w:style>
-  <w:style w:styleId="FootnoteBlockText" w:type="paragraph">
-    <w:name w:val="Footnote Block Text"/>
-    <w:basedOn w:val="Footnote Text"/>
-    <w:next w:val="Footnote Text"/>
-    <w:uiPriority w:val="9"/>
-    <w:unhideWhenUsed/>
-    <w:qFormat/>
-    <w:pPr>
-      <w:spacing w:after="100" w:before="100"/>
-      <w:ind w:firstLine="0" w:left="480" w:right="480"/>
-    </w:pPr>
-  </w:style>
-  <w:style w:default="1" w:styleId="DefaultParagraphFont" w:type="character">
-    <w:name w:val="Default Paragraph Font"/>
-    <w:semiHidden/>
-    <w:unhideWhenUsed/>
-  </w:style>
-  <w:style w:default="1" w:styleId="Table" w:type="table">
-    <w:name w:val="Table"/>
-    <w:basedOn w:val="TableNormal"/>
-    <w:semiHidden/>
-    <w:unhideWhenUsed/>
-    <w:qFormat/>
-    <w:tblPr>
-      <w:tblInd w:type="dxa" w:w="0"/>
-      <w:tblCellMar>
-        <w:top w:type="dxa" w:w="0"/>
-        <w:left w:type="dxa" w:w="108"/>
-        <w:bottom w:type="dxa" w:w="0"/>
-        <w:right w:type="dxa" w:w="108"/>
-      </w:tblCellMar>
-    </w:tblPr>
-    <w:tblStylePr w:type="firstRow">
-      <w:tblPr>
-        <w:jc w:val="left"/>
-        <w:tblInd w:type="dxa" w:w="0"/>
-      </w:tblPr>
-      <w:trPr>
-        <w:jc w:val="left"/>
-      </w:trPr>
-      <w:tcPr>
-        <w:tcBorders>
-          <w:bottom w:val="single"/>
-        </w:tcBorders>
-        <w:vAlign w:val="bottom"/>
-      </w:tcPr>
-    </w:tblStylePr>
-  </w:style>
-  <w:style w:customStyle="1" w:styleId="DefinitionTerm" w:type="paragraph">
-    <w:name w:val="Definition Term"/>
-    <w:basedOn w:val="Normal"/>
-    <w:next w:val="Definition"/>
-    <w:pPr>
-      <w:keepNext/>
-      <w:keepLines/>
-      <w:spacing w:after="0"/>
-    </w:pPr>
-    <w:rPr>
       <w:b/>
-    </w:rPr>
-  </w:style>
-  <w:style w:customStyle="1" w:styleId="Definition" w:type="paragraph">
-    <w:name w:val="Definition"/>
-    <w:basedOn w:val="Normal"/>
-  </w:style>
-  <w:style w:styleId="Caption" w:type="paragraph">
-    <w:name w:val="Caption"/>
-    <w:basedOn w:val="Normal"/>
-    <w:link w:val="BodyTextChar"/>
-    <w:pPr>
-      <w:spacing w:after="120" w:before="0"/>
-    </w:pPr>
-    <w:rPr>
-      <w:i/>
-    </w:rPr>
-  </w:style>
-  <w:style w:customStyle="1" w:styleId="TableCaption" w:type="paragraph">
-    <w:name w:val="Table Caption"/>
-    <w:basedOn w:val="Caption"/>
-    <w:pPr>
-      <w:keepNext/>
-    </w:pPr>
-  </w:style>
-  <w:style w:customStyle="1" w:styleId="ImageCaption" w:type="paragraph">
-    <w:name w:val="Image Caption"/>
-    <w:basedOn w:val="Caption"/>
-  </w:style>
-  <w:style w:customStyle="1" w:styleId="Figure" w:type="paragraph">
-    <w:name w:val="Figure"/>
-    <w:basedOn w:val="Normal"/>
-  </w:style>
-  <w:style w:customStyle="1" w:styleId="CaptionedFigure" w:type="paragraph">
-    <w:name w:val="Captioned Figure"/>
-    <w:basedOn w:val="Figure"/>
-    <w:pPr>
-      <w:keepNext/>
-    </w:pPr>
-  </w:style>
-  <w:style w:customStyle="1" w:styleId="BodyTextChar" w:type="character">
-    <w:name w:val="Body Text Char"/>
-    <w:basedOn w:val="DefaultParagraphFont"/>
-    <w:link w:val="BodyText"/>
-  </w:style>
-  <w:style w:customStyle="1" w:styleId="VerbatimChar" w:type="character">
-    <w:name w:val="Verbatim Char"/>
-    <w:basedOn w:val="BodyTextChar"/>
-    <w:rPr>
-      <w:rFonts w:ascii="Consolas" w:hAnsi="Consolas"/>
-      <w:sz w:val="22"/>
-    </w:rPr>
-  </w:style>
-  <w:style w:customStyle="1" w:styleId="SectionNumber" w:type="character">
-    <w:name w:val="Section Number"/>
-    <w:basedOn w:val="BodyTextChar"/>
-  </w:style>
-  <w:style w:styleId="FootnoteReference" w:type="character">
-    <w:name w:val="Footnote Reference"/>
-    <w:basedOn w:val="BodyTextChar"/>
-    <w:rPr>
-      <w:vertAlign w:val="superscript"/>
-    </w:rPr>
-  </w:style>
-  <w:style w:styleId="Hyperlink" w:type="character">
-    <w:name w:val="Hyperlink"/>
-    <w:basedOn w:val="BodyTextChar"/>
-    <w:rPr>
-      <w:color w:themeColor="accent1" w:val="4F81BD"/>
-    </w:rPr>
-  </w:style>
-  <w:style w:styleId="TOCHeading" w:type="paragraph">
-    <w:name w:val="TOC Heading"/>
-    <w:basedOn w:val="Heading1"/>
-    <w:next w:val="BodyText"/>
-    <w:uiPriority w:val="39"/>
-    <w:unhideWhenUsed/>
-    <w:qFormat/>
-    <w:pPr>
-      <w:spacing w:before="240" w:line="259" w:lineRule="auto"/>
-      <w:outlineLvl w:val="9"/>
-    </w:pPr>
-    <w:rPr>
-      <w:rFonts w:asciiTheme="majorHAnsi" w:cstheme="majorBidi" w:eastAsiaTheme="majorEastAsia" w:hAnsiTheme="majorHAnsi"/>
-      <w:b w:val="0"/>
-      <w:bCs w:val="0"/>
-      <w:color w:themeColor="accent1" w:themeShade="BF" w:val="365F91"/>
+      <w:sz w:val="20"/>
+      <w:szCs w:val="20"/>
     </w:rPr>
   </w:style>
   <w:style w:type="paragraph" w:customStyle="1" w:styleId="SourceCode">
@@ -5569,104 +6082,46 @@
         <a:sysClr val="window" lastClr="FFFFFF"/>
       </a:lt1>
       <a:dk2>
-        <a:srgbClr val="1F497D"/>
+        <a:srgbClr val="44546A"/>
       </a:dk2>
       <a:lt2>
-        <a:srgbClr val="EEECE1"/>
+        <a:srgbClr val="E7E6E6"/>
       </a:lt2>
       <a:accent1>
-        <a:srgbClr val="4F81BD"/>
+        <a:srgbClr val="4472C4"/>
       </a:accent1>
       <a:accent2>
-        <a:srgbClr val="C0504D"/>
+        <a:srgbClr val="ED7D31"/>
       </a:accent2>
       <a:accent3>
-        <a:srgbClr val="9BBB59"/>
+        <a:srgbClr val="A5A5A5"/>
       </a:accent3>
       <a:accent4>
-        <a:srgbClr val="8064A2"/>
+        <a:srgbClr val="FFC000"/>
       </a:accent4>
       <a:accent5>
-        <a:srgbClr val="4BACC6"/>
+        <a:srgbClr val="5B9BD5"/>
       </a:accent5>
       <a:accent6>
-        <a:srgbClr val="F79646"/>
+        <a:srgbClr val="70AD47"/>
       </a:accent6>
       <a:hlink>
-        <a:srgbClr val="0000FF"/>
+        <a:srgbClr val="0563C1"/>
       </a:hlink>
       <a:folHlink>
-        <a:srgbClr val="800080"/>
+        <a:srgbClr val="954F72"/>
       </a:folHlink>
     </a:clrScheme>
     <a:fontScheme name="Office">
       <a:majorFont>
         <a:latin typeface="Calibri"/>
-        <a:ea typeface=""/>
+        <a:ea typeface="Calibri"/>
         <a:cs typeface=""/>
-        <a:font script="Jpan" typeface="ＭＳ ゴシック"/>
-        <a:font script="Hang" typeface="맑은 고딕"/>
-        <a:font script="Hans" typeface="宋体"/>
-        <a:font script="Hant" typeface="新細明體"/>
-        <a:font script="Arab" typeface="Times New Roman"/>
-        <a:font script="Hebr" typeface="Times New Roman"/>
-        <a:font script="Thai" typeface="Angsana New"/>
-        <a:font script="Ethi" typeface="Nyala"/>
-        <a:font script="Beng" typeface="Vrinda"/>
-        <a:font script="Gujr" typeface="Shruti"/>
-        <a:font script="Khmr" typeface="MoolBoran"/>
-        <a:font script="Knda" typeface="Tunga"/>
-        <a:font script="Guru" typeface="Raavi"/>
-        <a:font script="Cans" typeface="Euphemia"/>
-        <a:font script="Cher" typeface="Plantagenet Cherokee"/>
-        <a:font script="Yiii" typeface="Microsoft Yi Baiti"/>
-        <a:font script="Tibt" typeface="Microsoft Himalaya"/>
-        <a:font script="Thaa" typeface="MV Boli"/>
-        <a:font script="Deva" typeface="Mangal"/>
-        <a:font script="Telu" typeface="Gautami"/>
-        <a:font script="Taml" typeface="Latha"/>
-        <a:font script="Syrc" typeface="Estrangelo Edessa"/>
-        <a:font script="Orya" typeface="Kalinga"/>
-        <a:font script="Mlym" typeface="Kartika"/>
-        <a:font script="Laoo" typeface="DokChampa"/>
-        <a:font script="Sinh" typeface="Iskoola Pota"/>
-        <a:font script="Mong" typeface="Mongolian Baiti"/>
-        <a:font script="Viet" typeface="Times New Roman"/>
-        <a:font script="Uigh" typeface="Microsoft Uighur"/>
       </a:majorFont>
       <a:minorFont>
-        <a:latin typeface="Cambria"/>
-        <a:ea typeface=""/>
+        <a:latin typeface="Calibri"/>
+        <a:ea typeface="Calibri"/>
         <a:cs typeface=""/>
-        <a:font script="Jpan" typeface="ＭＳ 明朝"/>
-        <a:font script="Hang" typeface="맑은 고딕"/>
-        <a:font script="Hans" typeface="宋体"/>
-        <a:font script="Hant" typeface="新細明體"/>
-        <a:font script="Arab" typeface="Arial"/>
-        <a:font script="Hebr" typeface="Arial"/>
-        <a:font script="Thai" typeface="Cordia New"/>
-        <a:font script="Ethi" typeface="Nyala"/>
-        <a:font script="Beng" typeface="Vrinda"/>
-        <a:font script="Gujr" typeface="Shruti"/>
-        <a:font script="Khmr" typeface="DaunPenh"/>
-        <a:font script="Knda" typeface="Tunga"/>
-        <a:font script="Guru" typeface="Raavi"/>
-        <a:font script="Cans" typeface="Euphemia"/>
-        <a:font script="Cher" typeface="Plantagenet Cherokee"/>
-        <a:font script="Yiii" typeface="Microsoft Yi Baiti"/>
-        <a:font script="Tibt" typeface="Microsoft Himalaya"/>
-        <a:font script="Thaa" typeface="MV Boli"/>
-        <a:font script="Deva" typeface="Mangal"/>
-        <a:font script="Telu" typeface="Gautami"/>
-        <a:font script="Taml" typeface="Latha"/>
-        <a:font script="Syrc" typeface="Estrangelo Edessa"/>
-        <a:font script="Orya" typeface="Kalinga"/>
-        <a:font script="Mlym" typeface="Kartika"/>
-        <a:font script="Laoo" typeface="DokChampa"/>
-        <a:font script="Sinh" typeface="Iskoola Pota"/>
-        <a:font script="Mong" typeface="Mongolian Baiti"/>
-        <a:font script="Viet" typeface="Arial"/>
-        <a:font script="Uigh" typeface="Microsoft Uighur"/>
       </a:minorFont>
     </a:fontScheme>
     <a:fmtScheme name="Office">
@@ -5678,200 +6133,134 @@
           <a:gsLst>
             <a:gs pos="0">
               <a:schemeClr val="phClr">
-                <a:tint val="50000"/>
-                <a:satMod val="300000"/>
+                <a:lumMod val="110000"/>
+                <a:satMod val="105000"/>
+                <a:tint val="67000"/>
               </a:schemeClr>
             </a:gs>
-            <a:gs pos="35000">
+            <a:gs pos="50000">
               <a:schemeClr val="phClr">
-                <a:tint val="37000"/>
-                <a:satMod val="300000"/>
+                <a:lumMod val="105000"/>
+                <a:satMod val="103000"/>
+                <a:tint val="73000"/>
               </a:schemeClr>
             </a:gs>
             <a:gs pos="100000">
               <a:schemeClr val="phClr">
-                <a:tint val="15000"/>
-                <a:satMod val="350000"/>
+                <a:lumMod val="105000"/>
+                <a:satMod val="109000"/>
+                <a:tint val="81000"/>
               </a:schemeClr>
             </a:gs>
           </a:gsLst>
-          <a:lin ang="16200000" scaled="1"/>
+          <a:lin ang="5400000" scaled="0"/>
         </a:gradFill>
         <a:gradFill rotWithShape="1">
           <a:gsLst>
             <a:gs pos="0">
               <a:schemeClr val="phClr">
-                <a:tint val="100000"/>
+                <a:satMod val="103000"/>
+                <a:lumMod val="102000"/>
+                <a:tint val="94000"/>
+              </a:schemeClr>
+            </a:gs>
+            <a:gs pos="50000">
+              <a:schemeClr val="phClr">
+                <a:satMod val="110000"/>
+                <a:lumMod val="100000"/>
                 <a:shade val="100000"/>
-                <a:satMod val="130000"/>
               </a:schemeClr>
             </a:gs>
             <a:gs pos="100000">
               <a:schemeClr val="phClr">
-                <a:tint val="50000"/>
-                <a:shade val="100000"/>
-                <a:satMod val="350000"/>
+                <a:lumMod val="99000"/>
+                <a:satMod val="120000"/>
+                <a:shade val="78000"/>
               </a:schemeClr>
             </a:gs>
           </a:gsLst>
-          <a:lin ang="16200000" scaled="0"/>
+          <a:lin ang="5400000" scaled="0"/>
         </a:gradFill>
       </a:fillStyleLst>
       <a:lnStyleLst>
-        <a:ln w="9525" cap="flat" cmpd="sng" algn="ctr">
-          <a:solidFill>
-            <a:schemeClr val="phClr">
-              <a:shade val="95000"/>
-              <a:satMod val="105000"/>
-            </a:schemeClr>
-          </a:solidFill>
-          <a:prstDash val="solid"/>
-        </a:ln>
-        <a:ln w="25400" cap="flat" cmpd="sng" algn="ctr">
+        <a:ln w="6350" cap="flat" cmpd="sng" algn="ctr">
           <a:solidFill>
             <a:schemeClr val="phClr"/>
           </a:solidFill>
           <a:prstDash val="solid"/>
+          <a:miter lim="800000"/>
         </a:ln>
-        <a:ln w="38100" cap="flat" cmpd="sng" algn="ctr">
+        <a:ln w="12700" cap="flat" cmpd="sng" algn="ctr">
           <a:solidFill>
             <a:schemeClr val="phClr"/>
           </a:solidFill>
           <a:prstDash val="solid"/>
+          <a:miter lim="800000"/>
+        </a:ln>
+        <a:ln w="19050" cap="flat" cmpd="sng" algn="ctr">
+          <a:solidFill>
+            <a:schemeClr val="phClr"/>
+          </a:solidFill>
+          <a:prstDash val="solid"/>
+          <a:miter lim="800000"/>
         </a:ln>
       </a:lnStyleLst>
       <a:effectStyleLst>
         <a:effectStyle>
+          <a:effectLst/>
+        </a:effectStyle>
+        <a:effectStyle>
+          <a:effectLst/>
+        </a:effectStyle>
+        <a:effectStyle>
           <a:effectLst>
-            <a:outerShdw blurRad="40000" dist="20000" dir="5400000" rotWithShape="0">
+            <a:outerShdw blurRad="57150" dist="19050" dir="5400000" algn="ctr" rotWithShape="0">
               <a:srgbClr val="000000">
-                <a:alpha val="38000"/>
+                <a:alpha val="63000"/>
               </a:srgbClr>
             </a:outerShdw>
           </a:effectLst>
-        </a:effectStyle>
-        <a:effectStyle>
-          <a:effectLst>
-            <a:outerShdw blurRad="40000" dist="23000" dir="5400000" rotWithShape="0">
-              <a:srgbClr val="000000">
-                <a:alpha val="35000"/>
-              </a:srgbClr>
-            </a:outerShdw>
-          </a:effectLst>
-        </a:effectStyle>
-        <a:effectStyle>
-          <a:effectLst>
-            <a:outerShdw blurRad="40000" dist="23000" dir="5400000" rotWithShape="0">
-              <a:srgbClr val="000000">
-                <a:alpha val="35000"/>
-              </a:srgbClr>
-            </a:outerShdw>
-          </a:effectLst>
-          <a:scene3d>
-            <a:camera prst="orthographicFront">
-              <a:rot lat="0" lon="0" rev="0"/>
-            </a:camera>
-            <a:lightRig rig="threePt" dir="t">
-              <a:rot lat="0" lon="0" rev="1200000"/>
-            </a:lightRig>
-          </a:scene3d>
-          <a:sp3d>
-            <a:bevelT w="63500" h="25400"/>
-          </a:sp3d>
         </a:effectStyle>
       </a:effectStyleLst>
       <a:bgFillStyleLst>
         <a:solidFill>
           <a:schemeClr val="phClr"/>
         </a:solidFill>
+        <a:solidFill>
+          <a:schemeClr val="phClr">
+            <a:tint val="95000"/>
+            <a:satMod val="170000"/>
+          </a:schemeClr>
+        </a:solidFill>
         <a:gradFill rotWithShape="1">
           <a:gsLst>
             <a:gs pos="0">
               <a:schemeClr val="phClr">
-                <a:tint val="40000"/>
-                <a:satMod val="350000"/>
+                <a:tint val="93000"/>
+                <a:satMod val="150000"/>
+                <a:shade val="98000"/>
+                <a:lumMod val="102000"/>
               </a:schemeClr>
             </a:gs>
-            <a:gs pos="40000">
+            <a:gs pos="50000">
               <a:schemeClr val="phClr">
-                <a:tint val="45000"/>
-                <a:shade val="99000"/>
-                <a:satMod val="350000"/>
+                <a:tint val="98000"/>
+                <a:satMod val="130000"/>
+                <a:shade val="90000"/>
+                <a:lumMod val="103000"/>
               </a:schemeClr>
             </a:gs>
             <a:gs pos="100000">
               <a:schemeClr val="phClr">
-                <a:shade val="20000"/>
-                <a:satMod val="255000"/>
+                <a:shade val="63000"/>
+                <a:satMod val="120000"/>
               </a:schemeClr>
             </a:gs>
           </a:gsLst>
-          <a:path path="circle">
-            <a:fillToRect l="50000" t="-80000" r="50000" b="180000"/>
-          </a:path>
-        </a:gradFill>
-        <a:gradFill rotWithShape="1">
-          <a:gsLst>
-            <a:gs pos="0">
-              <a:schemeClr val="phClr">
-                <a:tint val="80000"/>
-                <a:satMod val="300000"/>
-              </a:schemeClr>
-            </a:gs>
-            <a:gs pos="100000">
-              <a:schemeClr val="phClr">
-                <a:shade val="30000"/>
-                <a:satMod val="200000"/>
-              </a:schemeClr>
-            </a:gs>
-          </a:gsLst>
-          <a:path path="circle">
-            <a:fillToRect l="50000" t="50000" r="50000" b="50000"/>
-          </a:path>
+          <a:lin ang="5400000" scaled="0"/>
         </a:gradFill>
       </a:bgFillStyleLst>
     </a:fmtScheme>
   </a:themeElements>
-  <a:objectDefaults>
-    <a:spDef>
-      <a:spPr/>
-      <a:bodyPr/>
-      <a:lstStyle/>
-      <a:style>
-        <a:lnRef idx="1">
-          <a:schemeClr val="accent1"/>
-        </a:lnRef>
-        <a:fillRef idx="3">
-          <a:schemeClr val="accent1"/>
-        </a:fillRef>
-        <a:effectRef idx="2">
-          <a:schemeClr val="accent1"/>
-        </a:effectRef>
-        <a:fontRef idx="minor">
-          <a:schemeClr val="lt1"/>
-        </a:fontRef>
-      </a:style>
-    </a:spDef>
-    <a:lnDef>
-      <a:spPr/>
-      <a:bodyPr/>
-      <a:lstStyle/>
-      <a:style>
-        <a:lnRef idx="2">
-          <a:schemeClr val="accent1"/>
-        </a:lnRef>
-        <a:fillRef idx="0">
-          <a:schemeClr val="accent1"/>
-        </a:fillRef>
-        <a:effectRef idx="1">
-          <a:schemeClr val="accent1"/>
-        </a:effectRef>
-        <a:fontRef idx="minor">
-          <a:schemeClr val="tx1"/>
-        </a:fontRef>
-      </a:style>
-    </a:lnDef>
-  </a:objectDefaults>
-  <a:extraClrSchemeLst/>
 </a:theme>
 </file>
</xml_diff>

<commit_message>
Update white papers and fix quiz submission error for free tier
Corrected white paper content regarding career recommendations and implemented a fix for the free tier quiz submission bug by including the CSRF token in the request headers.

Replit-Commit-Author: Agent
Replit-Commit-Session-Id: 1ff1730d-808e-42ab-9038-e7e4a8c0db8d
Replit-Commit-Checkpoint-Type: full_checkpoint
Replit-Commit-Event-Id: 280a82cb-3c6a-485c-837e-e028cb07fda0
Replit-Commit-Screenshot-Url: https://storage.googleapis.com/screenshot-production-us-central1/46781757-2995-4279-9668-5cbf554ead29/1ff1730d-808e-42ab-9038-e7e4a8c0db8d/4izPmHb
Replit-Helium-Checkpoint-Created: true
</commit_message>
<xml_diff>
--- a/docs/future-path-white-paper-2026-v1.1.docx
+++ b/docs/future-path-white-paper-2026-v1.1.docx
@@ -3317,25 +3317,43 @@
         <w:pStyle w:val="BodyText"/>
       </w:pPr>
       <w:r>
-        <w:t xml:space="preserve">During the assessment, students are invited to express which sectors of national importance</w:t>
-      </w:r>
-      <w:r>
-        <w:t xml:space="preserve"> </w:t>
-      </w:r>
-      <w:r>
-        <w:t xml:space="preserve">resonate with them. These choices are mapped to the Country Vision Alignment scoring dimension</w:t>
-      </w:r>
-      <w:r>
-        <w:t xml:space="preserve"> </w:t>
-      </w:r>
-      <w:r>
-        <w:t xml:space="preserve">and weighed accordingly in career recommendations. The platform's entire career catalogue is</w:t>
-      </w:r>
-      <w:r>
-        <w:t xml:space="preserve"> </w:t>
-      </w:r>
-      <w:r>
-        <w:t xml:space="preserve">tagged against UAE priority development sectors:</w:t>
+        <w:t xml:space="preserve">During the assessment, students select their country of education, which activates the</w:t>
+      </w:r>
+      <w:r>
+        <w:t xml:space="preserve"> </w:t>
+      </w:r>
+      <w:r>
+        <w:t xml:space="preserve">Country Vision Alignment scoring dimension. When UAE is selected, the platform</w:t>
+      </w:r>
+      <w:r>
+        <w:t xml:space="preserve"> </w:t>
+      </w:r>
+      <w:r>
+        <w:t xml:space="preserve">automatically cross-references every career in the catalogue against the UAE's officially</w:t>
+      </w:r>
+      <w:r>
+        <w:t xml:space="preserve"> </w:t>
+      </w:r>
+      <w:r>
+        <w:t xml:space="preserve">published priority development sectors, weighting recommendations towards careers that</w:t>
+      </w:r>
+      <w:r>
+        <w:t xml:space="preserve"> </w:t>
+      </w:r>
+      <w:r>
+        <w:t xml:space="preserve">directly support the nation's economic transformation agenda. This is not student</w:t>
+      </w:r>
+      <w:r>
+        <w:t xml:space="preserve"> </w:t>
+      </w:r>
+      <w:r>
+        <w:t xml:space="preserve">self-reporting — it is structural, automatic, and consistent across every assessment.</w:t>
+      </w:r>
+      <w:r>
+        <w:t xml:space="preserve"> </w:t>
+      </w:r>
+      <w:r>
+        <w:t xml:space="preserve">The platform's entire career catalogue is tagged against UAE priority development sectors:</w:t>
       </w:r>
     </w:p>
     <w:bookmarkStart w:id="38" w:name="Xbfcd36d165d4246bcf019e2e440601516ad4f05"/>

</xml_diff>